<commit_message>
feat: use master Excel totals for class and advisor columns in Word documents
</commit_message>
<xml_diff>
--- a/generated_students/Nguyễn Gia Khang_N25DECE053.docx
+++ b/generated_students/Nguyễn Gia Khang_N25DECE053.docx
@@ -9163,7 +9163,12 @@
             <w:noWrap/>
           </w:tcPr>
           <w:p>
-            <w:r/>
+            <w:pPr>
+              <w:jc w:val="center"/>
+            </w:pPr>
+            <w:r>
+              <w:t>67</w:t>
+            </w:r>
           </w:p>
         </w:tc>
         <w:tc>
@@ -9179,7 +9184,12 @@
             <w:noWrap/>
           </w:tcPr>
           <w:p>
-            <w:r/>
+            <w:pPr>
+              <w:jc w:val="center"/>
+            </w:pPr>
+            <w:r>
+              <w:t>67</w:t>
+            </w:r>
           </w:p>
         </w:tc>
       </w:tr>

</xml_diff>